<commit_message>
ID screen: IDs are deleted 90 days after they are sent, not after review
The "How your ID is used" notice told people their ID is deleted 90 days
after review. purgeExpiredIds measures from submission (submittedAt), as
the security review, the functions and the user manual all state — an
unreviewed ID must not be kept forever. The consent text a person agrees
to has to describe what actually happens, so it now says 90 days after
they send it, in both languages.

Version 1.0.5+6; manual rebuilt for 1.0.5 (6). 224 Dart tests passing.

Co-Authored-By: Claude Opus 5 <noreply@anthropic.com>
</commit_message>
<xml_diff>
--- a/trikekoto_app/docs/TrikeKoTo-User-Manual.docx
+++ b/trikekoto_app/docs/TrikeKoTo-User-Manual.docx
@@ -59,7 +59,7 @@
           <w:sz w:val="24"/>
           <w:szCs w:val="24"/>
         </w:rPr>
-        <w:t xml:space="preserve">Version 1.0.4 (5)</w:t>
+        <w:t xml:space="preserve">Version 1.0.5 (6)</w:t>
       </w:r>
     </w:p>
     <w:p>
@@ -278,7 +278,7 @@
         <w:rPr>
           <w:rFonts w:ascii="Calibri" w:cs="Calibri" w:eastAsia="Calibri" w:hAnsi="Calibri"/>
         </w:rPr>
-        <w:t xml:space="preserve">This manual describes version 1.0.4 (5). The version is printed at the bottom of the landing screen, the driver screen, the commuter Profile screen and the ID verification screen.</w:t>
+        <w:t xml:space="preserve">This manual describes version 1.0.5 (6). The version is printed at the bottom of the landing screen, the driver screen, the commuter Profile screen and the ID verification screen.</w:t>
       </w:r>
     </w:p>
     <w:p>

</xml_diff>

<commit_message>
User manual: real screenshots in place of the seven placeholders
test/manual/manual_screenshots_test.dart renders the shipped screens over
made-up data, in Filipino, at 1.0.5 (6), and writes docs/manual/*.png. It
is skipped unless MANUAL_SCREENSHOTS is defined. No live account is signed
in, so no real name, number or ID reaches the thesis appendix; the ID in
the review picture is a card drawn by the test and marked as a sample.

Map tiles are fetched once before the widget tests and served from memory
through OsmTiles.debugTileProvider, because network and file IO never
complete on a widget test's fake clock. The build script embeds the images
in both the Markdown and Word manuals. Roadmap row 91 updated.

Co-Authored-By: Claude Opus 5 <noreply@anthropic.com>
</commit_message>
<xml_diff>
--- a/trikekoto_app/docs/TrikeKoTo-User-Manual.docx
+++ b/trikekoto_app/docs/TrikeKoTo-User-Manual.docx
@@ -1423,19 +1423,49 @@
     </w:p>
     <w:p>
       <w:pPr>
-        <w:pBdr>
-          <w:top w:val="single" w:color="BFBFBF" w:sz="4"/>
-          <w:bottom w:val="single" w:color="BFBFBF" w:sz="4"/>
-        </w:pBdr>
+        <w:keepNext/>
         <w:spacing w:after="60" w:before="160"/>
         <w:jc w:val="center"/>
       </w:pPr>
       <w:r>
-        <w:rPr>
-          <w:rFonts w:ascii="Calibri" w:cs="Calibri" w:eastAsia="Calibri" w:hAnsi="Calibri"/>
-          <w:color w:val="8C8C8C"/>
-        </w:rPr>
-        <w:t xml:space="preserve">[ Insert screenshot here ]</w:t>
+        <w:drawing>
+          <wp:inline distT="0" distB="0" distL="0" distR="0">
+            <wp:extent cx="1628775" cy="4762500"/>
+            <wp:effectExtent t="0" r="0" b="0" l="0"/>
+            <wp:docPr id="1" name="fig-1-id-verification.png" descr="Figure 1. The ID verification screen" title="Figure 1. The ID verification screen"/>
+            <wp:cNvGraphicFramePr>
+              <a:graphicFrameLocks xmlns:a="http://schemas.openxmlformats.org/drawingml/2006/main" noChangeAspect="1"/>
+            </wp:cNvGraphicFramePr>
+            <a:graphic xmlns:a="http://schemas.openxmlformats.org/drawingml/2006/main">
+              <a:graphicData uri="http://schemas.openxmlformats.org/drawingml/2006/picture">
+                <pic:pic xmlns:pic="http://schemas.openxmlformats.org/drawingml/2006/picture">
+                  <pic:nvPicPr>
+                    <pic:cNvPr id="0" name="" descr=""/>
+                    <pic:cNvPicPr>
+                      <a:picLocks noChangeAspect="1" noChangeArrowheads="1"/>
+                    </pic:cNvPicPr>
+                  </pic:nvPicPr>
+                  <pic:blipFill>
+                    <a:blip r:embed="rId8" cstate="none"/>
+                    <a:srcRect/>
+                    <a:stretch>
+                      <a:fillRect/>
+                    </a:stretch>
+                  </pic:blipFill>
+                  <pic:spPr bwMode="auto">
+                    <a:xfrm>
+                      <a:off x="0" y="0"/>
+                      <a:ext cx="1628775" cy="4762500"/>
+                    </a:xfrm>
+                    <a:prstGeom prst="rect">
+                      <a:avLst/>
+                    </a:prstGeom>
+                  </pic:spPr>
+                </pic:pic>
+              </a:graphicData>
+            </a:graphic>
+          </wp:inline>
+        </w:drawing>
       </w:r>
     </w:p>
     <w:p>
@@ -2346,19 +2376,49 @@
     </w:p>
     <w:p>
       <w:pPr>
-        <w:pBdr>
-          <w:top w:val="single" w:color="BFBFBF" w:sz="4"/>
-          <w:bottom w:val="single" w:color="BFBFBF" w:sz="4"/>
-        </w:pBdr>
+        <w:keepNext/>
         <w:spacing w:after="60" w:before="160"/>
         <w:jc w:val="center"/>
       </w:pPr>
       <w:r>
-        <w:rPr>
-          <w:rFonts w:ascii="Calibri" w:cs="Calibri" w:eastAsia="Calibri" w:hAnsi="Calibri"/>
-          <w:color w:val="8C8C8C"/>
-        </w:rPr>
-        <w:t xml:space="preserve">[ Insert screenshot here ]</w:t>
+        <w:drawing>
+          <wp:inline distT="0" distB="0" distL="0" distR="0">
+            <wp:extent cx="2200275" cy="4762500"/>
+            <wp:effectExtent t="0" r="0" b="0" l="0"/>
+            <wp:docPr id="1" name="fig-2-sign-in.png" descr="Figure 2. Signing in with a mobile number" title="Figure 2. Signing in with a mobile number"/>
+            <wp:cNvGraphicFramePr>
+              <a:graphicFrameLocks xmlns:a="http://schemas.openxmlformats.org/drawingml/2006/main" noChangeAspect="1"/>
+            </wp:cNvGraphicFramePr>
+            <a:graphic xmlns:a="http://schemas.openxmlformats.org/drawingml/2006/main">
+              <a:graphicData uri="http://schemas.openxmlformats.org/drawingml/2006/picture">
+                <pic:pic xmlns:pic="http://schemas.openxmlformats.org/drawingml/2006/picture">
+                  <pic:nvPicPr>
+                    <pic:cNvPr id="0" name="" descr=""/>
+                    <pic:cNvPicPr>
+                      <a:picLocks noChangeAspect="1" noChangeArrowheads="1"/>
+                    </pic:cNvPicPr>
+                  </pic:nvPicPr>
+                  <pic:blipFill>
+                    <a:blip r:embed="rId9" cstate="none"/>
+                    <a:srcRect/>
+                    <a:stretch>
+                      <a:fillRect/>
+                    </a:stretch>
+                  </pic:blipFill>
+                  <pic:spPr bwMode="auto">
+                    <a:xfrm>
+                      <a:off x="0" y="0"/>
+                      <a:ext cx="2200275" cy="4762500"/>
+                    </a:xfrm>
+                    <a:prstGeom prst="rect">
+                      <a:avLst/>
+                    </a:prstGeom>
+                  </pic:spPr>
+                </pic:pic>
+              </a:graphicData>
+            </a:graphic>
+          </wp:inline>
+        </w:drawing>
       </w:r>
     </w:p>
     <w:p>
@@ -2414,19 +2474,49 @@
     </w:p>
     <w:p>
       <w:pPr>
-        <w:pBdr>
-          <w:top w:val="single" w:color="BFBFBF" w:sz="4"/>
-          <w:bottom w:val="single" w:color="BFBFBF" w:sz="4"/>
-        </w:pBdr>
+        <w:keepNext/>
         <w:spacing w:after="60" w:before="160"/>
         <w:jc w:val="center"/>
       </w:pPr>
       <w:r>
-        <w:rPr>
-          <w:rFonts w:ascii="Calibri" w:cs="Calibri" w:eastAsia="Calibri" w:hAnsi="Calibri"/>
-          <w:color w:val="8C8C8C"/>
-        </w:rPr>
-        <w:t xml:space="preserve">[ Insert screenshot here ]</w:t>
+        <w:drawing>
+          <wp:inline distT="0" distB="0" distL="0" distR="0">
+            <wp:extent cx="2200275" cy="4762500"/>
+            <wp:effectExtent t="0" r="0" b="0" l="0"/>
+            <wp:docPr id="1" name="fig-3-booking.png" descr="Figure 3. The booking screen" title="Figure 3. The booking screen"/>
+            <wp:cNvGraphicFramePr>
+              <a:graphicFrameLocks xmlns:a="http://schemas.openxmlformats.org/drawingml/2006/main" noChangeAspect="1"/>
+            </wp:cNvGraphicFramePr>
+            <a:graphic xmlns:a="http://schemas.openxmlformats.org/drawingml/2006/main">
+              <a:graphicData uri="http://schemas.openxmlformats.org/drawingml/2006/picture">
+                <pic:pic xmlns:pic="http://schemas.openxmlformats.org/drawingml/2006/picture">
+                  <pic:nvPicPr>
+                    <pic:cNvPr id="0" name="" descr=""/>
+                    <pic:cNvPicPr>
+                      <a:picLocks noChangeAspect="1" noChangeArrowheads="1"/>
+                    </pic:cNvPicPr>
+                  </pic:nvPicPr>
+                  <pic:blipFill>
+                    <a:blip r:embed="rId10" cstate="none"/>
+                    <a:srcRect/>
+                    <a:stretch>
+                      <a:fillRect/>
+                    </a:stretch>
+                  </pic:blipFill>
+                  <pic:spPr bwMode="auto">
+                    <a:xfrm>
+                      <a:off x="0" y="0"/>
+                      <a:ext cx="2200275" cy="4762500"/>
+                    </a:xfrm>
+                    <a:prstGeom prst="rect">
+                      <a:avLst/>
+                    </a:prstGeom>
+                  </pic:spPr>
+                </pic:pic>
+              </a:graphicData>
+            </a:graphic>
+          </wp:inline>
+        </w:drawing>
       </w:r>
     </w:p>
     <w:p>
@@ -2832,19 +2922,49 @@
     </w:p>
     <w:p>
       <w:pPr>
-        <w:pBdr>
-          <w:top w:val="single" w:color="BFBFBF" w:sz="4"/>
-          <w:bottom w:val="single" w:color="BFBFBF" w:sz="4"/>
-        </w:pBdr>
+        <w:keepNext/>
         <w:spacing w:after="60" w:before="160"/>
         <w:jc w:val="center"/>
       </w:pPr>
       <w:r>
-        <w:rPr>
-          <w:rFonts w:ascii="Calibri" w:cs="Calibri" w:eastAsia="Calibri" w:hAnsi="Calibri"/>
-          <w:color w:val="8C8C8C"/>
-        </w:rPr>
-        <w:t xml:space="preserve">[ Insert screenshot here ]</w:t>
+        <w:drawing>
+          <wp:inline distT="0" distB="0" distL="0" distR="0">
+            <wp:extent cx="2200275" cy="4762500"/>
+            <wp:effectExtent t="0" r="0" b="0" l="0"/>
+            <wp:docPr id="1" name="fig-4-tracking.png" descr="Figure 4. Tracking an accepted ride" title="Figure 4. Tracking an accepted ride"/>
+            <wp:cNvGraphicFramePr>
+              <a:graphicFrameLocks xmlns:a="http://schemas.openxmlformats.org/drawingml/2006/main" noChangeAspect="1"/>
+            </wp:cNvGraphicFramePr>
+            <a:graphic xmlns:a="http://schemas.openxmlformats.org/drawingml/2006/main">
+              <a:graphicData uri="http://schemas.openxmlformats.org/drawingml/2006/picture">
+                <pic:pic xmlns:pic="http://schemas.openxmlformats.org/drawingml/2006/picture">
+                  <pic:nvPicPr>
+                    <pic:cNvPr id="0" name="" descr=""/>
+                    <pic:cNvPicPr>
+                      <a:picLocks noChangeAspect="1" noChangeArrowheads="1"/>
+                    </pic:cNvPicPr>
+                  </pic:nvPicPr>
+                  <pic:blipFill>
+                    <a:blip r:embed="rId11" cstate="none"/>
+                    <a:srcRect/>
+                    <a:stretch>
+                      <a:fillRect/>
+                    </a:stretch>
+                  </pic:blipFill>
+                  <pic:spPr bwMode="auto">
+                    <a:xfrm>
+                      <a:off x="0" y="0"/>
+                      <a:ext cx="2200275" cy="4762500"/>
+                    </a:xfrm>
+                    <a:prstGeom prst="rect">
+                      <a:avLst/>
+                    </a:prstGeom>
+                  </pic:spPr>
+                </pic:pic>
+              </a:graphicData>
+            </a:graphic>
+          </wp:inline>
+        </w:drawing>
       </w:r>
     </w:p>
     <w:p>
@@ -4439,19 +4559,49 @@
     </w:p>
     <w:p>
       <w:pPr>
-        <w:pBdr>
-          <w:top w:val="single" w:color="BFBFBF" w:sz="4"/>
-          <w:bottom w:val="single" w:color="BFBFBF" w:sz="4"/>
-        </w:pBdr>
+        <w:keepNext/>
         <w:spacing w:after="60" w:before="160"/>
         <w:jc w:val="center"/>
       </w:pPr>
       <w:r>
-        <w:rPr>
-          <w:rFonts w:ascii="Calibri" w:cs="Calibri" w:eastAsia="Calibri" w:hAnsi="Calibri"/>
-          <w:color w:val="8C8C8C"/>
-        </w:rPr>
-        <w:t xml:space="preserve">[ Insert screenshot here ]</w:t>
+        <w:drawing>
+          <wp:inline distT="0" distB="0" distL="0" distR="0">
+            <wp:extent cx="2200275" cy="4762500"/>
+            <wp:effectExtent t="0" r="0" b="0" l="0"/>
+            <wp:docPr id="1" name="fig-5-driver-online.png" descr="Figure 5. The driver screen with the Online switch" title="Figure 5. The driver screen with the Online switch"/>
+            <wp:cNvGraphicFramePr>
+              <a:graphicFrameLocks xmlns:a="http://schemas.openxmlformats.org/drawingml/2006/main" noChangeAspect="1"/>
+            </wp:cNvGraphicFramePr>
+            <a:graphic xmlns:a="http://schemas.openxmlformats.org/drawingml/2006/main">
+              <a:graphicData uri="http://schemas.openxmlformats.org/drawingml/2006/picture">
+                <pic:pic xmlns:pic="http://schemas.openxmlformats.org/drawingml/2006/picture">
+                  <pic:nvPicPr>
+                    <pic:cNvPr id="0" name="" descr=""/>
+                    <pic:cNvPicPr>
+                      <a:picLocks noChangeAspect="1" noChangeArrowheads="1"/>
+                    </pic:cNvPicPr>
+                  </pic:nvPicPr>
+                  <pic:blipFill>
+                    <a:blip r:embed="rId12" cstate="none"/>
+                    <a:srcRect/>
+                    <a:stretch>
+                      <a:fillRect/>
+                    </a:stretch>
+                  </pic:blipFill>
+                  <pic:spPr bwMode="auto">
+                    <a:xfrm>
+                      <a:off x="0" y="0"/>
+                      <a:ext cx="2200275" cy="4762500"/>
+                    </a:xfrm>
+                    <a:prstGeom prst="rect">
+                      <a:avLst/>
+                    </a:prstGeom>
+                  </pic:spPr>
+                </pic:pic>
+              </a:graphicData>
+            </a:graphic>
+          </wp:inline>
+        </w:drawing>
       </w:r>
     </w:p>
     <w:p>
@@ -5164,19 +5314,49 @@
     </w:p>
     <w:p>
       <w:pPr>
-        <w:pBdr>
-          <w:top w:val="single" w:color="BFBFBF" w:sz="4"/>
-          <w:bottom w:val="single" w:color="BFBFBF" w:sz="4"/>
-        </w:pBdr>
+        <w:keepNext/>
         <w:spacing w:after="60" w:before="160"/>
         <w:jc w:val="center"/>
       </w:pPr>
       <w:r>
-        <w:rPr>
-          <w:rFonts w:ascii="Calibri" w:cs="Calibri" w:eastAsia="Calibri" w:hAnsi="Calibri"/>
-          <w:color w:val="8C8C8C"/>
-        </w:rPr>
-        <w:t xml:space="preserve">[ Insert screenshot here ]</w:t>
+        <w:drawing>
+          <wp:inline distT="0" distB="0" distL="0" distR="0">
+            <wp:extent cx="1190625" cy="4762500"/>
+            <wp:effectExtent t="0" r="0" b="0" l="0"/>
+            <wp:docPr id="1" name="fig-6-admin-dashboard.png" descr="Figure 6. The administrator dashboard" title="Figure 6. The administrator dashboard"/>
+            <wp:cNvGraphicFramePr>
+              <a:graphicFrameLocks xmlns:a="http://schemas.openxmlformats.org/drawingml/2006/main" noChangeAspect="1"/>
+            </wp:cNvGraphicFramePr>
+            <a:graphic xmlns:a="http://schemas.openxmlformats.org/drawingml/2006/main">
+              <a:graphicData uri="http://schemas.openxmlformats.org/drawingml/2006/picture">
+                <pic:pic xmlns:pic="http://schemas.openxmlformats.org/drawingml/2006/picture">
+                  <pic:nvPicPr>
+                    <pic:cNvPr id="0" name="" descr=""/>
+                    <pic:cNvPicPr>
+                      <a:picLocks noChangeAspect="1" noChangeArrowheads="1"/>
+                    </pic:cNvPicPr>
+                  </pic:nvPicPr>
+                  <pic:blipFill>
+                    <a:blip r:embed="rId13" cstate="none"/>
+                    <a:srcRect/>
+                    <a:stretch>
+                      <a:fillRect/>
+                    </a:stretch>
+                  </pic:blipFill>
+                  <pic:spPr bwMode="auto">
+                    <a:xfrm>
+                      <a:off x="0" y="0"/>
+                      <a:ext cx="1190625" cy="4762500"/>
+                    </a:xfrm>
+                    <a:prstGeom prst="rect">
+                      <a:avLst/>
+                    </a:prstGeom>
+                  </pic:spPr>
+                </pic:pic>
+              </a:graphicData>
+            </a:graphic>
+          </wp:inline>
+        </w:drawing>
       </w:r>
     </w:p>
     <w:p>
@@ -5845,19 +6025,49 @@
     </w:p>
     <w:p>
       <w:pPr>
-        <w:pBdr>
-          <w:top w:val="single" w:color="BFBFBF" w:sz="4"/>
-          <w:bottom w:val="single" w:color="BFBFBF" w:sz="4"/>
-        </w:pBdr>
+        <w:keepNext/>
         <w:spacing w:after="60" w:before="160"/>
         <w:jc w:val="center"/>
       </w:pPr>
       <w:r>
-        <w:rPr>
-          <w:rFonts w:ascii="Calibri" w:cs="Calibri" w:eastAsia="Calibri" w:hAnsi="Calibri"/>
-          <w:color w:val="8C8C8C"/>
-        </w:rPr>
-        <w:t xml:space="preserve">[ Insert screenshot here ]</w:t>
+        <w:drawing>
+          <wp:inline distT="0" distB="0" distL="0" distR="0">
+            <wp:extent cx="2476500" cy="3048000"/>
+            <wp:effectExtent t="0" r="0" b="0" l="0"/>
+            <wp:docPr id="1" name="fig-7-id-review.png" descr="Figure 7. Reviewing a submitted ID" title="Figure 7. Reviewing a submitted ID"/>
+            <wp:cNvGraphicFramePr>
+              <a:graphicFrameLocks xmlns:a="http://schemas.openxmlformats.org/drawingml/2006/main" noChangeAspect="1"/>
+            </wp:cNvGraphicFramePr>
+            <a:graphic xmlns:a="http://schemas.openxmlformats.org/drawingml/2006/main">
+              <a:graphicData uri="http://schemas.openxmlformats.org/drawingml/2006/picture">
+                <pic:pic xmlns:pic="http://schemas.openxmlformats.org/drawingml/2006/picture">
+                  <pic:nvPicPr>
+                    <pic:cNvPr id="0" name="" descr=""/>
+                    <pic:cNvPicPr>
+                      <a:picLocks noChangeAspect="1" noChangeArrowheads="1"/>
+                    </pic:cNvPicPr>
+                  </pic:nvPicPr>
+                  <pic:blipFill>
+                    <a:blip r:embed="rId14" cstate="none"/>
+                    <a:srcRect/>
+                    <a:stretch>
+                      <a:fillRect/>
+                    </a:stretch>
+                  </pic:blipFill>
+                  <pic:spPr bwMode="auto">
+                    <a:xfrm>
+                      <a:off x="0" y="0"/>
+                      <a:ext cx="2476500" cy="3048000"/>
+                    </a:xfrm>
+                    <a:prstGeom prst="rect">
+                      <a:avLst/>
+                    </a:prstGeom>
+                  </pic:spPr>
+                </pic:pic>
+              </a:graphicData>
+            </a:graphic>
+          </wp:inline>
+        </w:drawing>
       </w:r>
     </w:p>
     <w:p>

</xml_diff>